<commit_message>
updates to model scope document, ingestion and tactical readiness to only take summer going forward rather than whole summer
</commit_message>
<xml_diff>
--- a/prm_opt/Model Scope.docx
+++ b/prm_opt/Model Scope.docx
@@ -29,7 +29,13 @@
     </w:p>
     <w:p>
       <w:r>
-        <w:t xml:space="preserve">The PRM fleet optimisation model is a flight-level mixed integer optimisation model used to assess the operational requirement for PRM service vehicles and staff across a schedule period. </w:t>
+        <w:t>The PRM fleet optimisation model is a flight-level mixed integer optimisation model used to assess the operational requirement for PRM service vehicles and staff across a schedule</w:t>
+      </w:r>
+      <w:r>
+        <w:t>d</w:t>
+      </w:r>
+      <w:r>
+        <w:t xml:space="preserve"> period. </w:t>
       </w:r>
     </w:p>
     <w:p>
@@ -63,15 +69,7 @@
         </w:numPr>
       </w:pPr>
       <w:r>
-        <w:t xml:space="preserve">Service timings are </w:t>
-      </w:r>
-      <w:proofErr w:type="gramStart"/>
-      <w:r>
-        <w:t>represents</w:t>
-      </w:r>
-      <w:proofErr w:type="gramEnd"/>
-      <w:r>
-        <w:t xml:space="preserve"> through precomputed fixed intervals</w:t>
+        <w:t>Service timings are represents through precomputed fixed intervals</w:t>
       </w:r>
     </w:p>
     <w:p>
@@ -83,7 +81,15 @@
         </w:numPr>
       </w:pPr>
       <w:r>
-        <w:t>Existing Ambulifts are fixed and can not be purchased</w:t>
+        <w:t xml:space="preserve">Existing Ambulifts are fixed and </w:t>
+      </w:r>
+      <w:proofErr w:type="spellStart"/>
+      <w:r>
+        <w:t>can not</w:t>
+      </w:r>
+      <w:proofErr w:type="spellEnd"/>
+      <w:r>
+        <w:t xml:space="preserve"> be purchased</w:t>
       </w:r>
     </w:p>
     <w:p>
@@ -659,19 +665,7 @@
           <w:rPr>
             <w:rFonts w:ascii="Cambria Math" w:hAnsi="Cambria Math"/>
           </w:rPr>
-          <m:t xml:space="preserve">= </m:t>
-        </m:r>
-        <m:r>
-          <w:rPr>
-            <w:rFonts w:ascii="Cambria Math" w:hAnsi="Cambria Math"/>
-          </w:rPr>
-          <m:t>Mini</m:t>
-        </m:r>
-        <m:r>
-          <w:rPr>
-            <w:rFonts w:ascii="Cambria Math" w:hAnsi="Cambria Math"/>
-          </w:rPr>
-          <m:t>}</m:t>
+          <m:t>= Mini}</m:t>
         </m:r>
       </m:oMath>
       <w:r>
@@ -752,19 +746,7 @@
           <w:rPr>
             <w:rFonts w:ascii="Cambria Math" w:hAnsi="Cambria Math"/>
           </w:rPr>
-          <m:t xml:space="preserve">= </m:t>
-        </m:r>
-        <m:r>
-          <w:rPr>
-            <w:rFonts w:ascii="Cambria Math" w:hAnsi="Cambria Math"/>
-          </w:rPr>
-          <m:t>1</m:t>
-        </m:r>
-        <m:r>
-          <w:rPr>
-            <w:rFonts w:ascii="Cambria Math" w:hAnsi="Cambria Math"/>
-          </w:rPr>
-          <m:t>}</m:t>
+          <m:t>= 1}</m:t>
         </m:r>
       </m:oMath>
       <w:r>
@@ -996,13 +978,7 @@
           <w:rPr>
             <w:rFonts w:ascii="Cambria Math" w:eastAsiaTheme="minorEastAsia" w:hAnsi="Cambria Math"/>
           </w:rPr>
-          <m:t>f</m:t>
-        </m:r>
-        <m:r>
-          <w:rPr>
-            <w:rFonts w:ascii="Cambria Math" w:eastAsiaTheme="minorEastAsia" w:hAnsi="Cambria Math"/>
-          </w:rPr>
-          <m:t>∈F</m:t>
+          <m:t>f∈F</m:t>
         </m:r>
       </m:oMath>
       <w:r>
@@ -1101,13 +1077,7 @@
         <w:rPr>
           <w:rFonts w:eastAsiaTheme="minorEastAsia"/>
         </w:rPr>
-        <w:t xml:space="preserve">: </w:t>
-      </w:r>
-      <w:r>
-        <w:rPr>
-          <w:rFonts w:eastAsiaTheme="minorEastAsia"/>
-        </w:rPr>
-        <w:t>scheduled flight time</w:t>
+        <w:t>: scheduled flight time</w:t>
       </w:r>
     </w:p>
     <w:p>
@@ -1136,19 +1106,7 @@
               <w:rPr>
                 <w:rFonts w:ascii="Cambria Math" w:eastAsiaTheme="minorEastAsia" w:hAnsi="Cambria Math"/>
               </w:rPr>
-              <m:t>serviceAncho</m:t>
-            </m:r>
-            <m:r>
-              <w:rPr>
-                <w:rFonts w:ascii="Cambria Math" w:eastAsiaTheme="minorEastAsia" w:hAnsi="Cambria Math"/>
-              </w:rPr>
-              <m:t>r</m:t>
-            </m:r>
-            <m:r>
-              <w:rPr>
-                <w:rFonts w:ascii="Cambria Math" w:eastAsiaTheme="minorEastAsia" w:hAnsi="Cambria Math"/>
-              </w:rPr>
-              <m:t>Time</m:t>
+              <m:t>serviceAnchorTime</m:t>
             </m:r>
           </m:e>
           <m:sub>
@@ -1165,13 +1123,7 @@
         <w:rPr>
           <w:rFonts w:eastAsiaTheme="minorEastAsia"/>
         </w:rPr>
-        <w:t xml:space="preserve">: </w:t>
-      </w:r>
-      <w:r>
-        <w:rPr>
-          <w:rFonts w:eastAsiaTheme="minorEastAsia"/>
-        </w:rPr>
-        <w:t>fixed service anchor time to construct service intervals</w:t>
+        <w:t>: fixed service anchor time to construct service intervals</w:t>
       </w:r>
     </w:p>
     <w:p>
@@ -1364,19 +1316,7 @@
                   <w:rPr>
                     <w:rFonts w:ascii="Cambria Math" w:hAnsi="Cambria Math"/>
                   </w:rPr>
-                  <m:t>1</m:t>
-                </m:r>
-                <m:r>
-                  <w:rPr>
-                    <w:rFonts w:ascii="Cambria Math" w:hAnsi="Cambria Math"/>
-                  </w:rPr>
-                  <m:t xml:space="preserve">,  </m:t>
-                </m:r>
-                <m:r>
-                  <w:rPr>
-                    <w:rFonts w:ascii="Cambria Math" w:hAnsi="Cambria Math"/>
-                  </w:rPr>
-                  <m:t xml:space="preserve"> if flight f is an arrival</m:t>
+                  <m:t>1,   if flight f is an arrival</m:t>
                 </m:r>
               </m:e>
               <m:e>
@@ -1384,19 +1324,7 @@
                   <w:rPr>
                     <w:rFonts w:ascii="Cambria Math" w:hAnsi="Cambria Math"/>
                   </w:rPr>
-                  <m:t>0</m:t>
-                </m:r>
-                <m:r>
-                  <w:rPr>
-                    <w:rFonts w:ascii="Cambria Math" w:hAnsi="Cambria Math"/>
-                  </w:rPr>
-                  <m:t xml:space="preserve">,  </m:t>
-                </m:r>
-                <m:r>
-                  <w:rPr>
-                    <w:rFonts w:ascii="Cambria Math" w:hAnsi="Cambria Math"/>
-                  </w:rPr>
-                  <m:t xml:space="preserve"> if flight f is a departure</m:t>
+                  <m:t>0,   if flight f is a departure</m:t>
                 </m:r>
               </m:e>
             </m:eqArr>
@@ -1526,13 +1454,7 @@
         <w:rPr>
           <w:rFonts w:eastAsiaTheme="minorEastAsia"/>
         </w:rPr>
-        <w:t xml:space="preserve"> number of </w:t>
-      </w:r>
-      <w:r>
-        <w:rPr>
-          <w:rFonts w:eastAsiaTheme="minorEastAsia"/>
-        </w:rPr>
-        <w:t>WCHC passengers</w:t>
+        <w:t xml:space="preserve"> number of WCHC passengers</w:t>
       </w:r>
     </w:p>
     <w:p>
@@ -1588,13 +1510,7 @@
         <w:rPr>
           <w:rFonts w:eastAsiaTheme="minorEastAsia"/>
         </w:rPr>
-        <w:t xml:space="preserve"> number of </w:t>
-      </w:r>
-      <w:r>
-        <w:rPr>
-          <w:rFonts w:eastAsiaTheme="minorEastAsia"/>
-        </w:rPr>
-        <w:t>WCHS passengers</w:t>
+        <w:t xml:space="preserve"> number of WCHS passengers</w:t>
       </w:r>
     </w:p>
     <w:p>
@@ -1650,13 +1566,7 @@
         <w:rPr>
           <w:rFonts w:eastAsiaTheme="minorEastAsia"/>
         </w:rPr>
-        <w:t xml:space="preserve"> </w:t>
-      </w:r>
-      <w:r>
-        <w:rPr>
-          <w:rFonts w:eastAsiaTheme="minorEastAsia"/>
-        </w:rPr>
-        <w:t>number of WCHR passengers</w:t>
+        <w:t xml:space="preserve"> number of WCHR passengers</w:t>
       </w:r>
     </w:p>
     <w:p>
@@ -1774,13 +1684,7 @@
         <w:rPr>
           <w:rFonts w:eastAsiaTheme="minorEastAsia"/>
         </w:rPr>
-        <w:t xml:space="preserve"> number of PRM passengers requiring </w:t>
-      </w:r>
-      <w:r>
-        <w:rPr>
-          <w:rFonts w:eastAsiaTheme="minorEastAsia"/>
-        </w:rPr>
-        <w:t>wheelchair tie-down spaces</w:t>
+        <w:t xml:space="preserve"> number of PRM passengers requiring wheelchair tie-down spaces</w:t>
       </w:r>
     </w:p>
     <w:p>
@@ -1836,19 +1740,21 @@
         <w:rPr>
           <w:rFonts w:eastAsiaTheme="minorEastAsia"/>
         </w:rPr>
-        <w:t xml:space="preserve"> </w:t>
-      </w:r>
-      <w:r>
-        <w:rPr>
-          <w:rFonts w:eastAsiaTheme="minorEastAsia"/>
-        </w:rPr>
-        <w:t>the total nu</w:t>
-      </w:r>
-      <w:r>
-        <w:rPr>
-          <w:rFonts w:eastAsiaTheme="minorEastAsia"/>
-        </w:rPr>
-        <w:t>mber of passengers requiring a vertical transfer</w:t>
+        <w:t xml:space="preserve"> the total nu</w:t>
+      </w:r>
+      <w:proofErr w:type="spellStart"/>
+      <w:r>
+        <w:rPr>
+          <w:rFonts w:eastAsiaTheme="minorEastAsia"/>
+        </w:rPr>
+        <w:t>mber</w:t>
+      </w:r>
+      <w:proofErr w:type="spellEnd"/>
+      <w:r>
+        <w:rPr>
+          <w:rFonts w:eastAsiaTheme="minorEastAsia"/>
+        </w:rPr>
+        <w:t xml:space="preserve"> of passengers requiring a vertical transfer</w:t>
       </w:r>
     </w:p>
     <w:p>
@@ -1904,13 +1810,7 @@
         <w:rPr>
           <w:rFonts w:eastAsiaTheme="minorEastAsia"/>
         </w:rPr>
-        <w:t xml:space="preserve"> </w:t>
-      </w:r>
-      <w:r>
-        <w:rPr>
-          <w:rFonts w:eastAsiaTheme="minorEastAsia"/>
-        </w:rPr>
-        <w:t>number of vertical-transfer passengers requiring standard vehicle seats</w:t>
+        <w:t xml:space="preserve"> number of vertical-transfer passengers requiring standard vehicle seats</w:t>
       </w:r>
     </w:p>
     <w:p>
@@ -1951,13 +1851,7 @@
               <w:rPr>
                 <w:rFonts w:ascii="Cambria Math" w:hAnsi="Cambria Math"/>
               </w:rPr>
-              <m:t>vert,</m:t>
-            </m:r>
-            <m:r>
-              <w:rPr>
-                <w:rFonts w:ascii="Cambria Math" w:hAnsi="Cambria Math"/>
-              </w:rPr>
-              <m:t>wc</m:t>
+              <m:t>vert,wc</m:t>
             </m:r>
           </m:sup>
         </m:sSubSup>
@@ -1972,13 +1866,7 @@
         <w:rPr>
           <w:rFonts w:eastAsiaTheme="minorEastAsia"/>
         </w:rPr>
-        <w:t xml:space="preserve"> number of vertical-transfer passengers requiring </w:t>
-      </w:r>
-      <w:r>
-        <w:rPr>
-          <w:rFonts w:eastAsiaTheme="minorEastAsia"/>
-        </w:rPr>
-        <w:t>wheelchair tie-down spaces</w:t>
+        <w:t xml:space="preserve"> number of vertical-transfer passengers requiring wheelchair tie-down spaces</w:t>
       </w:r>
     </w:p>
     <w:p>
@@ -2019,11 +1907,19 @@
         </w:rPr>
         <w:t>, the Ambulift is treated as handling the verti</w:t>
       </w:r>
-      <w:r>
-        <w:rPr>
-          <w:rFonts w:eastAsiaTheme="minorEastAsia"/>
-        </w:rPr>
-        <w:t>cal and horizontal movement, so Ambulift capacity is checked against total seat and wheelchair demand</w:t>
+      <w:proofErr w:type="spellStart"/>
+      <w:r>
+        <w:rPr>
+          <w:rFonts w:eastAsiaTheme="minorEastAsia"/>
+        </w:rPr>
+        <w:t>cal</w:t>
+      </w:r>
+      <w:proofErr w:type="spellEnd"/>
+      <w:r>
+        <w:rPr>
+          <w:rFonts w:eastAsiaTheme="minorEastAsia"/>
+        </w:rPr>
+        <w:t xml:space="preserve"> and horizontal movement, so Ambulift capacity is checked against total seat and wheelchair demand</w:t>
       </w:r>
     </w:p>
     <w:p>
@@ -2285,13 +2181,7 @@
               <w:rPr>
                 <w:rFonts w:ascii="Cambria Math" w:eastAsiaTheme="minorEastAsia" w:hAnsi="Cambria Math"/>
               </w:rPr>
-              <m:t>Effective</m:t>
-            </m:r>
-            <m:r>
-              <w:rPr>
-                <w:rFonts w:ascii="Cambria Math" w:eastAsiaTheme="minorEastAsia" w:hAnsi="Cambria Math"/>
-              </w:rPr>
-              <m:t>Remote</m:t>
+              <m:t>EffectiveRemote</m:t>
             </m:r>
           </m:e>
           <m:sub>
@@ -2334,13 +2224,19 @@
         <w:rPr>
           <w:rFonts w:eastAsiaTheme="minorEastAsia"/>
         </w:rPr>
-        <w:t>: indicates that the flight is</w:t>
-      </w:r>
-      <w:r>
-        <w:rPr>
-          <w:rFonts w:eastAsiaTheme="minorEastAsia"/>
-        </w:rPr>
-        <w:t xml:space="preserve"> effectively remote or requiting a vertical transfer</w:t>
+        <w:t>: indicates that the flight is effectively remote or requi</w:t>
+      </w:r>
+      <w:r>
+        <w:rPr>
+          <w:rFonts w:eastAsiaTheme="minorEastAsia"/>
+        </w:rPr>
+        <w:t>r</w:t>
+      </w:r>
+      <w:r>
+        <w:rPr>
+          <w:rFonts w:eastAsiaTheme="minorEastAsia"/>
+        </w:rPr>
+        <w:t>ing a vertical transfer</w:t>
       </w:r>
     </w:p>
     <w:p>
@@ -2801,13 +2697,7 @@
         <w:rPr>
           <w:rFonts w:eastAsiaTheme="minorEastAsia"/>
         </w:rPr>
-        <w:t xml:space="preserve">: indicates that </w:t>
-      </w:r>
-      <w:r>
-        <w:rPr>
-          <w:rFonts w:eastAsiaTheme="minorEastAsia"/>
-        </w:rPr>
-        <w:t>a departure flight is a spin departure candidate</w:t>
+        <w:t>: indicates that a departure flight is a spin departure candidate</w:t>
       </w:r>
     </w:p>
     <w:p>
@@ -2921,19 +2811,7 @@
               <w:rPr>
                 <w:rFonts w:ascii="Cambria Math" w:eastAsiaTheme="minorEastAsia" w:hAnsi="Cambria Math"/>
               </w:rPr>
-              <m:t>Amb</m:t>
-            </m:r>
-            <m:r>
-              <w:rPr>
-                <w:rFonts w:ascii="Cambria Math" w:eastAsiaTheme="minorEastAsia" w:hAnsi="Cambria Math"/>
-              </w:rPr>
-              <m:t>,</m:t>
-            </m:r>
-            <m:r>
-              <w:rPr>
-                <w:rFonts w:ascii="Cambria Math" w:eastAsiaTheme="minorEastAsia" w:hAnsi="Cambria Math"/>
-              </w:rPr>
-              <m:t>Mini</m:t>
+              <m:t>Amb,Mini</m:t>
             </m:r>
           </m:e>
         </m:d>
@@ -3802,13 +3680,7 @@
           <w:rPr>
             <w:rFonts w:ascii="Cambria Math" w:eastAsiaTheme="minorEastAsia" w:hAnsi="Cambria Math"/>
           </w:rPr>
-          <m:t>f</m:t>
-        </m:r>
-        <m:r>
-          <w:rPr>
-            <w:rFonts w:ascii="Cambria Math" w:eastAsiaTheme="minorEastAsia" w:hAnsi="Cambria Math"/>
-          </w:rPr>
-          <m:t xml:space="preserve"> ∈F</m:t>
+          <m:t>f ∈F</m:t>
         </m:r>
       </m:oMath>
       <w:r>
@@ -3817,12 +3689,14 @@
         </w:rPr>
         <w:t xml:space="preserve">, </w:t>
       </w:r>
+      <w:proofErr w:type="spellStart"/>
       <w:r>
         <w:rPr>
           <w:rFonts w:eastAsiaTheme="minorEastAsia"/>
         </w:rPr>
         <w:t>ambulift</w:t>
       </w:r>
+      <w:proofErr w:type="spellEnd"/>
       <w:r>
         <w:t xml:space="preserve"> </w:t>
       </w:r>
@@ -3943,13 +3817,7 @@
               <w:rPr>
                 <w:rFonts w:ascii="Cambria Math" w:hAnsi="Cambria Math"/>
               </w:rPr>
-              <m:t>f</m:t>
-            </m:r>
-            <m:r>
-              <w:rPr>
-                <w:rFonts w:ascii="Cambria Math" w:hAnsi="Cambria Math"/>
-              </w:rPr>
-              <m:t>,SA</m:t>
+              <m:t>f,SA</m:t>
             </m:r>
           </m:sub>
           <m:sup>
@@ -4046,13 +3914,7 @@
               <w:rPr>
                 <w:rFonts w:ascii="Cambria Math" w:hAnsi="Cambria Math"/>
               </w:rPr>
-              <m:t>amb,</m:t>
-            </m:r>
-            <m:r>
-              <w:rPr>
-                <w:rFonts w:ascii="Cambria Math" w:hAnsi="Cambria Math"/>
-              </w:rPr>
-              <m:t>wc</m:t>
+              <m:t>amb,wc</m:t>
             </m:r>
           </m:sup>
         </m:sSubSup>
@@ -4196,13 +4058,7 @@
           <w:rPr>
             <w:rFonts w:ascii="Cambria Math" w:hAnsi="Cambria Math"/>
           </w:rPr>
-          <m:t xml:space="preserve"> </m:t>
-        </m:r>
-        <m:r>
-          <w:rPr>
-            <w:rFonts w:ascii="Cambria Math" w:hAnsi="Cambria Math"/>
-          </w:rPr>
-          <m:t>m ∈  {CM, CP}</m:t>
+          <m:t xml:space="preserve"> m ∈  {CM, CP}</m:t>
         </m:r>
       </m:oMath>
       <w:r>
@@ -4303,13 +4159,7 @@
           <w:rPr>
             <w:rFonts w:ascii="Cambria Math" w:hAnsi="Cambria Math"/>
           </w:rPr>
-          <m:t xml:space="preserve">    m ∈</m:t>
-        </m:r>
-        <m:r>
-          <w:rPr>
-            <w:rFonts w:ascii="Cambria Math" w:hAnsi="Cambria Math"/>
-          </w:rPr>
-          <m:t xml:space="preserve">  {CM, CP}</m:t>
+          <m:t xml:space="preserve">    m ∈  {CM, CP}</m:t>
         </m:r>
       </m:oMath>
       <w:r>
@@ -4329,7 +4179,21 @@
         <w:rPr>
           <w:rFonts w:eastAsiaTheme="minorEastAsia"/>
         </w:rPr>
-        <w:t>This is because the ambulift only handles the vertical component.</w:t>
+        <w:t xml:space="preserve">This is because the </w:t>
+      </w:r>
+      <w:proofErr w:type="spellStart"/>
+      <w:r>
+        <w:rPr>
+          <w:rFonts w:eastAsiaTheme="minorEastAsia"/>
+        </w:rPr>
+        <w:t>ambulift</w:t>
+      </w:r>
+      <w:proofErr w:type="spellEnd"/>
+      <w:r>
+        <w:rPr>
+          <w:rFonts w:eastAsiaTheme="minorEastAsia"/>
+        </w:rPr>
+        <w:t xml:space="preserve"> only handles the vertical component.</w:t>
       </w:r>
     </w:p>
     <w:p>
@@ -4375,13 +4239,7 @@
                 <w:rPr>
                   <w:rFonts w:ascii="Cambria Math" w:hAnsi="Cambria Math"/>
                 </w:rPr>
-                <m:t>f,</m:t>
-              </m:r>
-              <m:r>
-                <w:rPr>
-                  <w:rFonts w:ascii="Cambria Math" w:hAnsi="Cambria Math"/>
-                </w:rPr>
-                <m:t>r,m</m:t>
+                <m:t>f,r,m</m:t>
               </m:r>
             </m:sub>
             <m:sup>
@@ -4467,13 +4325,7 @@
                             <w:rPr>
                               <w:rFonts w:ascii="Cambria Math" w:hAnsi="Cambria Math"/>
                             </w:rPr>
-                            <m:t>f,</m:t>
-                          </m:r>
-                          <m:r>
-                            <w:rPr>
-                              <w:rFonts w:ascii="Cambria Math" w:hAnsi="Cambria Math"/>
-                            </w:rPr>
-                            <m:t>m</m:t>
+                            <m:t>f,m</m:t>
                           </m:r>
                         </m:sub>
                         <m:sup>
@@ -4516,13 +4368,7 @@
                             <w:rPr>
                               <w:rFonts w:ascii="Cambria Math" w:hAnsi="Cambria Math"/>
                             </w:rPr>
-                            <m:t>sea</m:t>
-                          </m:r>
-                          <m:r>
-                            <w:rPr>
-                              <w:rFonts w:ascii="Cambria Math" w:hAnsi="Cambria Math"/>
-                            </w:rPr>
-                            <m:t>t</m:t>
+                            <m:t>seat</m:t>
                           </m:r>
                         </m:sup>
                       </m:sSubSup>
@@ -4587,13 +4433,7 @@
                             <w:rPr>
                               <w:rFonts w:ascii="Cambria Math" w:hAnsi="Cambria Math"/>
                             </w:rPr>
-                            <m:t>amb,</m:t>
-                          </m:r>
-                          <m:r>
-                            <w:rPr>
-                              <w:rFonts w:ascii="Cambria Math" w:hAnsi="Cambria Math"/>
-                            </w:rPr>
-                            <m:t>wc</m:t>
+                            <m:t>amb,wc</m:t>
                           </m:r>
                         </m:sup>
                       </m:sSubSup>
@@ -5706,13 +5546,7 @@
         <w:rPr>
           <w:rFonts w:eastAsiaTheme="minorEastAsia"/>
         </w:rPr>
-        <w:t xml:space="preserve">, </w:t>
-      </w:r>
-      <w:r>
-        <w:rPr>
-          <w:rFonts w:eastAsiaTheme="minorEastAsia"/>
-        </w:rPr>
-        <w:t>the Ambulift interval is:</w:t>
+        <w:t>, the Ambulift interval is:</w:t>
       </w:r>
     </w:p>
     <w:p>
@@ -5884,13 +5718,7 @@
                 <w:rPr>
                   <w:rFonts w:ascii="Cambria Math" w:eastAsiaTheme="minorEastAsia" w:hAnsi="Cambria Math"/>
                 </w:rPr>
-                <m:t>amb</m:t>
-              </m:r>
-              <m:r>
-                <w:rPr>
-                  <w:rFonts w:ascii="Cambria Math" w:eastAsiaTheme="minorEastAsia" w:hAnsi="Cambria Math"/>
-                </w:rPr>
-                <m:t>, arr</m:t>
+                <m:t>amb, arr</m:t>
               </m:r>
             </m:sup>
           </m:sSubSup>
@@ -6047,13 +5875,7 @@
             <w:rPr>
               <w:rFonts w:ascii="Cambria Math" w:eastAsiaTheme="minorEastAsia" w:hAnsi="Cambria Math"/>
             </w:rPr>
-            <m:t xml:space="preserve"> </m:t>
-          </m:r>
-          <m:r>
-            <w:rPr>
-              <w:rFonts w:ascii="Cambria Math" w:eastAsiaTheme="minorEastAsia" w:hAnsi="Cambria Math"/>
-            </w:rPr>
-            <m:t xml:space="preserve"> </m:t>
+            <m:t xml:space="preserve">  </m:t>
           </m:r>
         </m:oMath>
       </m:oMathPara>
@@ -6096,13 +5918,7 @@
                 <w:rPr>
                   <w:rFonts w:ascii="Cambria Math" w:eastAsiaTheme="minorEastAsia" w:hAnsi="Cambria Math"/>
                 </w:rPr>
-                <m:t xml:space="preserve">amb, </m:t>
-              </m:r>
-              <m:r>
-                <w:rPr>
-                  <w:rFonts w:ascii="Cambria Math" w:eastAsiaTheme="minorEastAsia" w:hAnsi="Cambria Math"/>
-                </w:rPr>
-                <m:t>dep</m:t>
+                <m:t>amb, dep</m:t>
               </m:r>
             </m:sup>
           </m:sSubSup>
@@ -6179,13 +5995,7 @@
                 <w:rPr>
                   <w:rFonts w:ascii="Cambria Math" w:eastAsiaTheme="minorEastAsia" w:hAnsi="Cambria Math"/>
                 </w:rPr>
-                <m:t xml:space="preserve">amb, </m:t>
-              </m:r>
-              <m:r>
-                <w:rPr>
-                  <w:rFonts w:ascii="Cambria Math" w:eastAsiaTheme="minorEastAsia" w:hAnsi="Cambria Math"/>
-                </w:rPr>
-                <m:t>dep</m:t>
+                <m:t>amb, dep</m:t>
               </m:r>
             </m:sup>
           </m:sSubSup>
@@ -6276,53 +6086,6 @@
           <w:rFonts w:eastAsiaTheme="minorEastAsia"/>
         </w:rPr>
       </w:pPr>
-      <w:r>
-        <w:rPr>
-          <w:rFonts w:eastAsiaTheme="minorEastAsia"/>
-        </w:rPr>
-        <w:t xml:space="preserve">Where </w:t>
-      </w:r>
-      <m:oMath>
-        <m:sSub>
-          <m:sSubPr>
-            <m:ctrlPr>
-              <w:rPr>
-                <w:rFonts w:ascii="Cambria Math" w:eastAsiaTheme="minorEastAsia" w:hAnsi="Cambria Math"/>
-                <w:i/>
-              </w:rPr>
-            </m:ctrlPr>
-          </m:sSubPr>
-          <m:e>
-            <m:r>
-              <w:rPr>
-                <w:rFonts w:ascii="Cambria Math" w:eastAsiaTheme="minorEastAsia" w:hAnsi="Cambria Math"/>
-              </w:rPr>
-              <m:t>serviceAnchorTime</m:t>
-            </m:r>
-          </m:e>
-          <m:sub>
-            <m:r>
-              <w:rPr>
-                <w:rFonts w:ascii="Cambria Math" w:eastAsiaTheme="minorEastAsia" w:hAnsi="Cambria Math"/>
-              </w:rPr>
-              <m:t>f</m:t>
-            </m:r>
-          </m:sub>
-        </m:sSub>
-      </m:oMath>
-      <w:r>
-        <w:rPr>
-          <w:rFonts w:eastAsiaTheme="minorEastAsia"/>
-        </w:rPr>
-        <w:t xml:space="preserve"> is in minutes</w:t>
-      </w:r>
-    </w:p>
-    <w:p>
-      <w:pPr>
-        <w:rPr>
-          <w:rFonts w:eastAsiaTheme="minorEastAsia"/>
-        </w:rPr>
-      </w:pPr>
     </w:p>
     <w:p>
       <w:pPr>
@@ -6639,13 +6402,7 @@
                 <w:rPr>
                   <w:rFonts w:ascii="Cambria Math" w:eastAsiaTheme="minorEastAsia" w:hAnsi="Cambria Math"/>
                 </w:rPr>
-                <m:t>f,r,</m:t>
-              </m:r>
-              <m:r>
-                <w:rPr>
-                  <w:rFonts w:ascii="Cambria Math" w:eastAsiaTheme="minorEastAsia" w:hAnsi="Cambria Math"/>
-                </w:rPr>
-                <m:t>SM</m:t>
+                <m:t>f,r,SM</m:t>
               </m:r>
             </m:sub>
             <m:sup>
@@ -6653,13 +6410,7 @@
                 <w:rPr>
                   <w:rFonts w:ascii="Cambria Math" w:eastAsiaTheme="minorEastAsia" w:hAnsi="Cambria Math"/>
                 </w:rPr>
-                <m:t>mini</m:t>
-              </m:r>
-              <m:r>
-                <w:rPr>
-                  <w:rFonts w:ascii="Cambria Math" w:eastAsiaTheme="minorEastAsia" w:hAnsi="Cambria Math"/>
-                </w:rPr>
-                <m:t>, arr</m:t>
+                <m:t>mini, arr</m:t>
               </m:r>
             </m:sup>
           </m:sSubSup>
@@ -6728,13 +6479,7 @@
                 <w:rPr>
                   <w:rFonts w:ascii="Cambria Math" w:eastAsiaTheme="minorEastAsia" w:hAnsi="Cambria Math"/>
                 </w:rPr>
-                <m:t>f,r</m:t>
-              </m:r>
-              <m:r>
-                <w:rPr>
-                  <w:rFonts w:ascii="Cambria Math" w:eastAsiaTheme="minorEastAsia" w:hAnsi="Cambria Math"/>
-                </w:rPr>
-                <m:t>, SM</m:t>
+                <m:t>f,r, SM</m:t>
               </m:r>
             </m:sub>
             <m:sup>
@@ -6742,13 +6487,7 @@
                 <w:rPr>
                   <w:rFonts w:ascii="Cambria Math" w:eastAsiaTheme="minorEastAsia" w:hAnsi="Cambria Math"/>
                 </w:rPr>
-                <m:t>mini</m:t>
-              </m:r>
-              <m:r>
-                <w:rPr>
-                  <w:rFonts w:ascii="Cambria Math" w:eastAsiaTheme="minorEastAsia" w:hAnsi="Cambria Math"/>
-                </w:rPr>
-                <m:t>, arr</m:t>
+                <m:t>mini, arr</m:t>
               </m:r>
             </m:sup>
           </m:sSubSup>
@@ -6849,13 +6588,7 @@
                 <w:rPr>
                   <w:rFonts w:ascii="Cambria Math" w:eastAsiaTheme="minorEastAsia" w:hAnsi="Cambria Math"/>
                 </w:rPr>
-                <m:t>f,r,</m:t>
-              </m:r>
-              <m:r>
-                <w:rPr>
-                  <w:rFonts w:ascii="Cambria Math" w:eastAsiaTheme="minorEastAsia" w:hAnsi="Cambria Math"/>
-                </w:rPr>
-                <m:t>SM</m:t>
+                <m:t>f,r,SM</m:t>
               </m:r>
             </m:sub>
             <m:sup>
@@ -6863,13 +6596,7 @@
                 <w:rPr>
                   <w:rFonts w:ascii="Cambria Math" w:eastAsiaTheme="minorEastAsia" w:hAnsi="Cambria Math"/>
                 </w:rPr>
-                <m:t>mini</m:t>
-              </m:r>
-              <m:r>
-                <w:rPr>
-                  <w:rFonts w:ascii="Cambria Math" w:eastAsiaTheme="minorEastAsia" w:hAnsi="Cambria Math"/>
-                </w:rPr>
-                <m:t>, dep</m:t>
+                <m:t>mini, dep</m:t>
               </m:r>
             </m:sup>
           </m:sSubSup>
@@ -6938,13 +6665,7 @@
                 <w:rPr>
                   <w:rFonts w:ascii="Cambria Math" w:eastAsiaTheme="minorEastAsia" w:hAnsi="Cambria Math"/>
                 </w:rPr>
-                <m:t>f,r,</m:t>
-              </m:r>
-              <m:r>
-                <w:rPr>
-                  <w:rFonts w:ascii="Cambria Math" w:eastAsiaTheme="minorEastAsia" w:hAnsi="Cambria Math"/>
-                </w:rPr>
-                <m:t>SM</m:t>
+                <m:t>f,r,SM</m:t>
               </m:r>
             </m:sub>
             <m:sup>
@@ -6952,13 +6673,7 @@
                 <w:rPr>
                   <w:rFonts w:ascii="Cambria Math" w:eastAsiaTheme="minorEastAsia" w:hAnsi="Cambria Math"/>
                 </w:rPr>
-                <m:t>mini</m:t>
-              </m:r>
-              <m:r>
-                <w:rPr>
-                  <w:rFonts w:ascii="Cambria Math" w:eastAsiaTheme="minorEastAsia" w:hAnsi="Cambria Math"/>
-                </w:rPr>
-                <m:t>, dep</m:t>
+                <m:t>mini, dep</m:t>
               </m:r>
             </m:sup>
           </m:sSubSup>
@@ -7517,19 +7232,8 @@
         <w:rPr>
           <w:rFonts w:eastAsiaTheme="minorEastAsia"/>
         </w:rPr>
-        <w:t xml:space="preserve">For </w:t>
-      </w:r>
-      <w:r>
-        <w:rPr>
-          <w:rFonts w:eastAsiaTheme="minorEastAsia"/>
-        </w:rPr>
-        <w:t>departures</w:t>
-      </w:r>
-      <w:r>
-        <w:rPr>
-          <w:rFonts w:eastAsiaTheme="minorEastAsia"/>
-        </w:rPr>
-        <w:t>:</w:t>
+        <w:lastRenderedPageBreak/>
+        <w:t>For departures:</w:t>
       </w:r>
     </w:p>
     <w:p>
@@ -7962,13 +7666,7 @@
                 <w:rPr>
                   <w:rFonts w:ascii="Cambria Math" w:eastAsiaTheme="minorEastAsia" w:hAnsi="Cambria Math"/>
                 </w:rPr>
-                <m:t>f</m:t>
-              </m:r>
-              <m:r>
-                <w:rPr>
-                  <w:rFonts w:ascii="Cambria Math" w:eastAsiaTheme="minorEastAsia" w:hAnsi="Cambria Math"/>
-                </w:rPr>
-                <m:t>,SA</m:t>
+                <m:t>f,SA</m:t>
               </m:r>
             </m:sub>
             <m:sup>
@@ -8075,13 +7773,7 @@
                     <w:rPr>
                       <w:rFonts w:ascii="Cambria Math" w:eastAsiaTheme="minorEastAsia" w:hAnsi="Cambria Math"/>
                     </w:rPr>
-                    <m:t>f,r,</m:t>
-                  </m:r>
-                  <m:r>
-                    <w:rPr>
-                      <w:rFonts w:ascii="Cambria Math" w:eastAsiaTheme="minorEastAsia" w:hAnsi="Cambria Math"/>
-                    </w:rPr>
-                    <m:t>SA</m:t>
+                    <m:t>f,r,SA</m:t>
                   </m:r>
                 </m:sub>
                 <m:sup>
@@ -8128,13 +7820,7 @@
                 <w:rPr>
                   <w:rFonts w:ascii="Cambria Math" w:eastAsiaTheme="minorEastAsia" w:hAnsi="Cambria Math"/>
                 </w:rPr>
-                <m:t>f,</m:t>
-              </m:r>
-              <m:r>
-                <w:rPr>
-                  <w:rFonts w:ascii="Cambria Math" w:eastAsiaTheme="minorEastAsia" w:hAnsi="Cambria Math"/>
-                </w:rPr>
-                <m:t>CM</m:t>
+                <m:t>f,CM</m:t>
               </m:r>
             </m:sub>
             <m:sup>
@@ -8150,13 +7836,7 @@
             <w:rPr>
               <w:rFonts w:ascii="Cambria Math" w:eastAsiaTheme="minorEastAsia" w:hAnsi="Cambria Math"/>
             </w:rPr>
-            <m:t>=</m:t>
-          </m:r>
-          <m:r>
-            <w:rPr>
-              <w:rFonts w:ascii="Cambria Math" w:eastAsiaTheme="minorEastAsia" w:hAnsi="Cambria Math"/>
-            </w:rPr>
-            <m:t>Max</m:t>
+            <m:t>=Max</m:t>
           </m:r>
           <m:sSubSup>
             <m:sSubSupPr>
@@ -8257,13 +7937,7 @@
                 <w:rPr>
                   <w:rFonts w:ascii="Cambria Math" w:eastAsiaTheme="minorEastAsia" w:hAnsi="Cambria Math"/>
                 </w:rPr>
-                <m:t>f,C</m:t>
-              </m:r>
-              <m:r>
-                <w:rPr>
-                  <w:rFonts w:ascii="Cambria Math" w:eastAsiaTheme="minorEastAsia" w:hAnsi="Cambria Math"/>
-                </w:rPr>
-                <m:t>P</m:t>
+                <m:t>f,CP</m:t>
               </m:r>
             </m:sub>
             <m:sup>
@@ -8380,102 +8054,7 @@
                 <w:rPr>
                   <w:rFonts w:ascii="Cambria Math" w:eastAsiaTheme="minorEastAsia" w:hAnsi="Cambria Math"/>
                 </w:rPr>
-                <m:t>f,S</m:t>
-              </m:r>
-              <m:r>
-                <w:rPr>
-                  <w:rFonts w:ascii="Cambria Math" w:eastAsiaTheme="minorEastAsia" w:hAnsi="Cambria Math"/>
-                </w:rPr>
-                <m:t>M</m:t>
-              </m:r>
-            </m:sub>
-            <m:sup>
-              <m:r>
-                <w:rPr>
-                  <w:rFonts w:ascii="Cambria Math" w:eastAsiaTheme="minorEastAsia" w:hAnsi="Cambria Math"/>
-                </w:rPr>
-                <m:t>staff</m:t>
-              </m:r>
-            </m:sup>
-          </m:sSubSup>
-          <m:r>
-            <w:rPr>
-              <w:rFonts w:ascii="Cambria Math" w:eastAsiaTheme="minorEastAsia" w:hAnsi="Cambria Math"/>
-            </w:rPr>
-            <m:t>=</m:t>
-          </m:r>
-          <m:r>
-            <w:rPr>
-              <w:rFonts w:ascii="Cambria Math" w:eastAsiaTheme="minorEastAsia" w:hAnsi="Cambria Math"/>
-            </w:rPr>
-            <m:t xml:space="preserve"> </m:t>
-          </m:r>
-          <m:sSub>
-            <m:sSubPr>
-              <m:ctrlPr>
-                <w:rPr>
-                  <w:rFonts w:ascii="Cambria Math" w:eastAsiaTheme="minorEastAsia" w:hAnsi="Cambria Math"/>
-                  <w:i/>
-                </w:rPr>
-              </m:ctrlPr>
-            </m:sSubPr>
-            <m:e>
-              <m:r>
-                <w:rPr>
-                  <w:rFonts w:ascii="Cambria Math" w:eastAsiaTheme="minorEastAsia" w:hAnsi="Cambria Math"/>
-                </w:rPr>
-                <m:t>τ</m:t>
-              </m:r>
-            </m:e>
-            <m:sub>
-              <m:r>
-                <w:rPr>
-                  <w:rFonts w:ascii="Cambria Math" w:eastAsiaTheme="minorEastAsia" w:hAnsi="Cambria Math"/>
-                </w:rPr>
-                <m:t>mini</m:t>
-              </m:r>
-            </m:sub>
-          </m:sSub>
-        </m:oMath>
-      </m:oMathPara>
-    </w:p>
-    <w:p>
-      <w:pPr>
-        <w:rPr>
-          <w:rFonts w:eastAsiaTheme="minorEastAsia"/>
-        </w:rPr>
-      </w:pPr>
-      <m:oMathPara>
-        <m:oMath>
-          <m:sSubSup>
-            <m:sSubSupPr>
-              <m:ctrlPr>
-                <w:rPr>
-                  <w:rFonts w:ascii="Cambria Math" w:eastAsiaTheme="minorEastAsia" w:hAnsi="Cambria Math"/>
-                  <w:i/>
-                </w:rPr>
-              </m:ctrlPr>
-            </m:sSubSupPr>
-            <m:e>
-              <m:r>
-                <w:rPr>
-                  <w:rFonts w:ascii="Cambria Math" w:eastAsiaTheme="minorEastAsia" w:hAnsi="Cambria Math"/>
-                </w:rPr>
-                <m:t>Dur</m:t>
-              </m:r>
-            </m:e>
-            <m:sub>
-              <m:r>
-                <w:rPr>
-                  <w:rFonts w:ascii="Cambria Math" w:eastAsiaTheme="minorEastAsia" w:hAnsi="Cambria Math"/>
-                </w:rPr>
-                <m:t>f,S</m:t>
-              </m:r>
-              <m:r>
-                <w:rPr>
-                  <w:rFonts w:ascii="Cambria Math" w:eastAsiaTheme="minorEastAsia" w:hAnsi="Cambria Math"/>
-                </w:rPr>
-                <m:t>P</m:t>
+                <m:t>f,SM</m:t>
               </m:r>
             </m:sub>
             <m:sup>
@@ -8515,32 +8094,12 @@
                 <w:rPr>
                   <w:rFonts w:ascii="Cambria Math" w:eastAsiaTheme="minorEastAsia" w:hAnsi="Cambria Math"/>
                 </w:rPr>
-                <m:t>push</m:t>
+                <m:t>mini</m:t>
               </m:r>
             </m:sub>
           </m:sSub>
         </m:oMath>
       </m:oMathPara>
-    </w:p>
-    <w:p>
-      <w:pPr>
-        <w:rPr>
-          <w:rFonts w:eastAsiaTheme="minorEastAsia"/>
-        </w:rPr>
-      </w:pPr>
-    </w:p>
-    <w:p>
-      <w:pPr>
-        <w:rPr>
-          <w:rFonts w:eastAsiaTheme="minorEastAsia"/>
-        </w:rPr>
-      </w:pPr>
-      <w:r>
-        <w:rPr>
-          <w:rFonts w:eastAsiaTheme="minorEastAsia"/>
-        </w:rPr>
-        <w:t>For arrivals:</w:t>
-      </w:r>
     </w:p>
     <w:p>
       <w:pPr>
@@ -8564,7 +8123,7 @@
                 <w:rPr>
                   <w:rFonts w:ascii="Cambria Math" w:eastAsiaTheme="minorEastAsia" w:hAnsi="Cambria Math"/>
                 </w:rPr>
-                <m:t>s</m:t>
+                <m:t>Dur</m:t>
               </m:r>
             </m:e>
             <m:sub>
@@ -8572,13 +8131,7 @@
                 <w:rPr>
                   <w:rFonts w:ascii="Cambria Math" w:eastAsiaTheme="minorEastAsia" w:hAnsi="Cambria Math"/>
                 </w:rPr>
-                <m:t xml:space="preserve">f, </m:t>
-              </m:r>
-              <m:r>
-                <w:rPr>
-                  <w:rFonts w:ascii="Cambria Math" w:eastAsiaTheme="minorEastAsia" w:hAnsi="Cambria Math"/>
-                </w:rPr>
-                <m:t>m</m:t>
+                <m:t>f,SP</m:t>
               </m:r>
             </m:sub>
             <m:sup>
@@ -8610,7 +8163,7 @@
                 <w:rPr>
                   <w:rFonts w:ascii="Cambria Math" w:eastAsiaTheme="minorEastAsia" w:hAnsi="Cambria Math"/>
                 </w:rPr>
-                <m:t>A</m:t>
+                <m:t>τ</m:t>
               </m:r>
             </m:e>
             <m:sub>
@@ -8618,12 +8171,32 @@
                 <w:rPr>
                   <w:rFonts w:ascii="Cambria Math" w:eastAsiaTheme="minorEastAsia" w:hAnsi="Cambria Math"/>
                 </w:rPr>
-                <m:t>f</m:t>
+                <m:t>push</m:t>
               </m:r>
             </m:sub>
           </m:sSub>
         </m:oMath>
       </m:oMathPara>
+    </w:p>
+    <w:p>
+      <w:pPr>
+        <w:rPr>
+          <w:rFonts w:eastAsiaTheme="minorEastAsia"/>
+        </w:rPr>
+      </w:pPr>
+    </w:p>
+    <w:p>
+      <w:pPr>
+        <w:rPr>
+          <w:rFonts w:eastAsiaTheme="minorEastAsia"/>
+        </w:rPr>
+      </w:pPr>
+      <w:r>
+        <w:rPr>
+          <w:rFonts w:eastAsiaTheme="minorEastAsia"/>
+        </w:rPr>
+        <w:t>For arrivals:</w:t>
+      </w:r>
     </w:p>
     <w:p>
       <w:pPr>
@@ -8647,7 +8220,7 @@
                 <w:rPr>
                   <w:rFonts w:ascii="Cambria Math" w:eastAsiaTheme="minorEastAsia" w:hAnsi="Cambria Math"/>
                 </w:rPr>
-                <m:t>e</m:t>
+                <m:t>s</m:t>
               </m:r>
             </m:e>
             <m:sub>
@@ -8655,13 +8228,7 @@
                 <w:rPr>
                   <w:rFonts w:ascii="Cambria Math" w:eastAsiaTheme="minorEastAsia" w:hAnsi="Cambria Math"/>
                 </w:rPr>
-                <m:t xml:space="preserve">f, </m:t>
-              </m:r>
-              <m:r>
-                <w:rPr>
-                  <w:rFonts w:ascii="Cambria Math" w:eastAsiaTheme="minorEastAsia" w:hAnsi="Cambria Math"/>
-                </w:rPr>
-                <m:t>m</m:t>
+                <m:t>f, m</m:t>
               </m:r>
             </m:sub>
             <m:sup>
@@ -8705,74 +8272,8 @@
               </m:r>
             </m:sub>
           </m:sSub>
-          <m:r>
-            <w:rPr>
-              <w:rFonts w:ascii="Cambria Math" w:eastAsiaTheme="minorEastAsia" w:hAnsi="Cambria Math"/>
-            </w:rPr>
-            <m:t xml:space="preserve">+ </m:t>
-          </m:r>
-          <m:sSubSup>
-            <m:sSubSupPr>
-              <m:ctrlPr>
-                <w:rPr>
-                  <w:rFonts w:ascii="Cambria Math" w:eastAsiaTheme="minorEastAsia" w:hAnsi="Cambria Math"/>
-                  <w:i/>
-                </w:rPr>
-              </m:ctrlPr>
-            </m:sSubSupPr>
-            <m:e>
-              <m:r>
-                <w:rPr>
-                  <w:rFonts w:ascii="Cambria Math" w:eastAsiaTheme="minorEastAsia" w:hAnsi="Cambria Math"/>
-                </w:rPr>
-                <m:t>Dur</m:t>
-              </m:r>
-            </m:e>
-            <m:sub>
-              <m:r>
-                <w:rPr>
-                  <w:rFonts w:ascii="Cambria Math" w:eastAsiaTheme="minorEastAsia" w:hAnsi="Cambria Math"/>
-                </w:rPr>
-                <m:t>f</m:t>
-              </m:r>
-              <m:r>
-                <w:rPr>
-                  <w:rFonts w:ascii="Cambria Math" w:eastAsiaTheme="minorEastAsia" w:hAnsi="Cambria Math"/>
-                </w:rPr>
-                <m:t>,m</m:t>
-              </m:r>
-            </m:sub>
-            <m:sup>
-              <m:r>
-                <w:rPr>
-                  <w:rFonts w:ascii="Cambria Math" w:eastAsiaTheme="minorEastAsia" w:hAnsi="Cambria Math"/>
-                </w:rPr>
-                <m:t>staff</m:t>
-              </m:r>
-            </m:sup>
-          </m:sSubSup>
         </m:oMath>
       </m:oMathPara>
-    </w:p>
-    <w:p>
-      <w:pPr>
-        <w:rPr>
-          <w:rFonts w:eastAsiaTheme="minorEastAsia"/>
-        </w:rPr>
-      </w:pPr>
-    </w:p>
-    <w:p>
-      <w:pPr>
-        <w:rPr>
-          <w:rFonts w:eastAsiaTheme="minorEastAsia"/>
-        </w:rPr>
-      </w:pPr>
-      <w:r>
-        <w:rPr>
-          <w:rFonts w:eastAsiaTheme="minorEastAsia"/>
-        </w:rPr>
-        <w:t>For departures:</w:t>
-      </w:r>
     </w:p>
     <w:p>
       <w:pPr>
@@ -8804,13 +8305,7 @@
                 <w:rPr>
                   <w:rFonts w:ascii="Cambria Math" w:eastAsiaTheme="minorEastAsia" w:hAnsi="Cambria Math"/>
                 </w:rPr>
-                <m:t xml:space="preserve">f, </m:t>
-              </m:r>
-              <m:r>
-                <w:rPr>
-                  <w:rFonts w:ascii="Cambria Math" w:eastAsiaTheme="minorEastAsia" w:hAnsi="Cambria Math"/>
-                </w:rPr>
-                <m:t>m</m:t>
+                <m:t>f, m</m:t>
               </m:r>
             </m:sub>
             <m:sup>
@@ -8854,8 +8349,68 @@
               </m:r>
             </m:sub>
           </m:sSub>
+          <m:r>
+            <w:rPr>
+              <w:rFonts w:ascii="Cambria Math" w:eastAsiaTheme="minorEastAsia" w:hAnsi="Cambria Math"/>
+            </w:rPr>
+            <m:t xml:space="preserve">+ </m:t>
+          </m:r>
+          <m:sSubSup>
+            <m:sSubSupPr>
+              <m:ctrlPr>
+                <w:rPr>
+                  <w:rFonts w:ascii="Cambria Math" w:eastAsiaTheme="minorEastAsia" w:hAnsi="Cambria Math"/>
+                  <w:i/>
+                </w:rPr>
+              </m:ctrlPr>
+            </m:sSubSupPr>
+            <m:e>
+              <m:r>
+                <w:rPr>
+                  <w:rFonts w:ascii="Cambria Math" w:eastAsiaTheme="minorEastAsia" w:hAnsi="Cambria Math"/>
+                </w:rPr>
+                <m:t>Dur</m:t>
+              </m:r>
+            </m:e>
+            <m:sub>
+              <m:r>
+                <w:rPr>
+                  <w:rFonts w:ascii="Cambria Math" w:eastAsiaTheme="minorEastAsia" w:hAnsi="Cambria Math"/>
+                </w:rPr>
+                <m:t>f,m</m:t>
+              </m:r>
+            </m:sub>
+            <m:sup>
+              <m:r>
+                <w:rPr>
+                  <w:rFonts w:ascii="Cambria Math" w:eastAsiaTheme="minorEastAsia" w:hAnsi="Cambria Math"/>
+                </w:rPr>
+                <m:t>staff</m:t>
+              </m:r>
+            </m:sup>
+          </m:sSubSup>
         </m:oMath>
       </m:oMathPara>
+    </w:p>
+    <w:p>
+      <w:pPr>
+        <w:rPr>
+          <w:rFonts w:eastAsiaTheme="minorEastAsia"/>
+        </w:rPr>
+      </w:pPr>
+    </w:p>
+    <w:p>
+      <w:pPr>
+        <w:rPr>
+          <w:rFonts w:eastAsiaTheme="minorEastAsia"/>
+        </w:rPr>
+      </w:pPr>
+      <w:r>
+        <w:rPr>
+          <w:rFonts w:eastAsiaTheme="minorEastAsia"/>
+        </w:rPr>
+        <w:t>For departures:</w:t>
+      </w:r>
     </w:p>
     <w:p>
       <w:pPr>
@@ -8879,7 +8434,7 @@
                 <w:rPr>
                   <w:rFonts w:ascii="Cambria Math" w:eastAsiaTheme="minorEastAsia" w:hAnsi="Cambria Math"/>
                 </w:rPr>
-                <m:t>s</m:t>
+                <m:t>e</m:t>
               </m:r>
             </m:e>
             <m:sub>
@@ -8887,13 +8442,7 @@
                 <w:rPr>
                   <w:rFonts w:ascii="Cambria Math" w:eastAsiaTheme="minorEastAsia" w:hAnsi="Cambria Math"/>
                 </w:rPr>
-                <m:t xml:space="preserve">f, </m:t>
-              </m:r>
-              <m:r>
-                <w:rPr>
-                  <w:rFonts w:ascii="Cambria Math" w:eastAsiaTheme="minorEastAsia" w:hAnsi="Cambria Math"/>
-                </w:rPr>
-                <m:t>m</m:t>
+                <m:t>f, m</m:t>
               </m:r>
             </m:sub>
             <m:sup>
@@ -8937,6 +8486,83 @@
               </m:r>
             </m:sub>
           </m:sSub>
+        </m:oMath>
+      </m:oMathPara>
+    </w:p>
+    <w:p>
+      <w:pPr>
+        <w:rPr>
+          <w:rFonts w:eastAsiaTheme="minorEastAsia"/>
+        </w:rPr>
+      </w:pPr>
+      <m:oMathPara>
+        <m:oMath>
+          <m:sSubSup>
+            <m:sSubSupPr>
+              <m:ctrlPr>
+                <w:rPr>
+                  <w:rFonts w:ascii="Cambria Math" w:eastAsiaTheme="minorEastAsia" w:hAnsi="Cambria Math"/>
+                  <w:i/>
+                </w:rPr>
+              </m:ctrlPr>
+            </m:sSubSupPr>
+            <m:e>
+              <m:r>
+                <w:rPr>
+                  <w:rFonts w:ascii="Cambria Math" w:eastAsiaTheme="minorEastAsia" w:hAnsi="Cambria Math"/>
+                </w:rPr>
+                <m:t>s</m:t>
+              </m:r>
+            </m:e>
+            <m:sub>
+              <m:r>
+                <w:rPr>
+                  <w:rFonts w:ascii="Cambria Math" w:eastAsiaTheme="minorEastAsia" w:hAnsi="Cambria Math"/>
+                </w:rPr>
+                <m:t>f, m</m:t>
+              </m:r>
+            </m:sub>
+            <m:sup>
+              <m:r>
+                <w:rPr>
+                  <w:rFonts w:ascii="Cambria Math" w:eastAsiaTheme="minorEastAsia" w:hAnsi="Cambria Math"/>
+                </w:rPr>
+                <m:t>staff</m:t>
+              </m:r>
+            </m:sup>
+          </m:sSubSup>
+          <m:r>
+            <w:rPr>
+              <w:rFonts w:ascii="Cambria Math" w:eastAsiaTheme="minorEastAsia" w:hAnsi="Cambria Math"/>
+            </w:rPr>
+            <m:t xml:space="preserve">= </m:t>
+          </m:r>
+          <m:sSub>
+            <m:sSubPr>
+              <m:ctrlPr>
+                <w:rPr>
+                  <w:rFonts w:ascii="Cambria Math" w:eastAsiaTheme="minorEastAsia" w:hAnsi="Cambria Math"/>
+                  <w:i/>
+                </w:rPr>
+              </m:ctrlPr>
+            </m:sSubPr>
+            <m:e>
+              <m:r>
+                <w:rPr>
+                  <w:rFonts w:ascii="Cambria Math" w:eastAsiaTheme="minorEastAsia" w:hAnsi="Cambria Math"/>
+                </w:rPr>
+                <m:t>A</m:t>
+              </m:r>
+            </m:e>
+            <m:sub>
+              <m:r>
+                <w:rPr>
+                  <w:rFonts w:ascii="Cambria Math" w:eastAsiaTheme="minorEastAsia" w:hAnsi="Cambria Math"/>
+                </w:rPr>
+                <m:t>f</m:t>
+              </m:r>
+            </m:sub>
+          </m:sSub>
           <m:r>
             <w:rPr>
               <w:rFonts w:ascii="Cambria Math" w:eastAsiaTheme="minorEastAsia" w:hAnsi="Cambria Math"/>
@@ -9032,17 +8658,8 @@
           <w:i/>
           <w:iCs/>
         </w:rPr>
-        <w:t xml:space="preserve">Vertical Mode </w:t>
-      </w:r>
-      <w:proofErr w:type="gramStart"/>
-      <w:r>
-        <w:rPr>
-          <w:i/>
-          <w:iCs/>
-        </w:rPr>
-        <w:t>First-Contact</w:t>
-      </w:r>
-      <w:proofErr w:type="gramEnd"/>
+        <w:t>Vertical Mode First-Contact</w:t>
+      </w:r>
     </w:p>
     <w:p>
       <w:pPr>
@@ -9090,13 +8707,7 @@
           <w:rPr>
             <w:rFonts w:ascii="Cambria Math" w:hAnsi="Cambria Math"/>
           </w:rPr>
-          <m:t xml:space="preserve">, </m:t>
-        </m:r>
-        <m:r>
-          <w:rPr>
-            <w:rFonts w:ascii="Cambria Math" w:hAnsi="Cambria Math"/>
-          </w:rPr>
-          <m:t xml:space="preserve">Ambulift r ∈ </m:t>
+          <m:t xml:space="preserve">, Ambulift r ∈ </m:t>
         </m:r>
         <m:sSup>
           <m:sSupPr>
@@ -9128,13 +8739,7 @@
           <w:rPr>
             <w:rFonts w:ascii="Cambria Math" w:hAnsi="Cambria Math"/>
           </w:rPr>
-          <m:t xml:space="preserve">, and vertical mode </m:t>
-        </m:r>
-        <m:r>
-          <w:rPr>
-            <w:rFonts w:ascii="Cambria Math" w:hAnsi="Cambria Math"/>
-          </w:rPr>
-          <m:t>m ∈</m:t>
+          <m:t>, and vertical mode m ∈</m:t>
         </m:r>
         <m:sSup>
           <m:sSupPr>
@@ -9661,19 +9266,7 @@
                 <w:rPr>
                   <w:rFonts w:ascii="Cambria Math" w:hAnsi="Cambria Math"/>
                 </w:rPr>
-                <m:t>OnTime</m:t>
-              </m:r>
-              <m:r>
-                <w:rPr>
-                  <w:rFonts w:ascii="Cambria Math" w:hAnsi="Cambria Math"/>
-                </w:rPr>
-                <m:t>Wc</m:t>
-              </m:r>
-              <m:r>
-                <w:rPr>
-                  <w:rFonts w:ascii="Cambria Math" w:hAnsi="Cambria Math"/>
-                </w:rPr>
-                <m:t>Cap</m:t>
+                <m:t>OnTimeWcCap</m:t>
               </m:r>
             </m:e>
             <m:sub>
@@ -9947,13 +9540,7 @@
                 <w:rPr>
                   <w:rFonts w:ascii="Cambria Math" w:hAnsi="Cambria Math"/>
                 </w:rPr>
-                <m:t>OnTime</m:t>
-              </m:r>
-              <m:r>
-                <w:rPr>
-                  <w:rFonts w:ascii="Cambria Math" w:hAnsi="Cambria Math"/>
-                </w:rPr>
-                <m:t>Wc</m:t>
+                <m:t>OnTimeWc</m:t>
               </m:r>
             </m:e>
             <m:sub>
@@ -10041,13 +9628,7 @@
                     <w:rPr>
                       <w:rFonts w:ascii="Cambria Math" w:hAnsi="Cambria Math"/>
                     </w:rPr>
-                    <m:t>amb,</m:t>
-                  </m:r>
-                  <m:r>
-                    <w:rPr>
-                      <w:rFonts w:ascii="Cambria Math" w:hAnsi="Cambria Math"/>
-                    </w:rPr>
-                    <m:t>wc</m:t>
+                    <m:t>amb,wc</m:t>
                   </m:r>
                 </m:sup>
               </m:sSubSup>
@@ -10073,19 +9654,7 @@
                 <w:rPr>
                   <w:rFonts w:ascii="Cambria Math" w:eastAsiaTheme="minorEastAsia" w:hAnsi="Cambria Math"/>
                 </w:rPr>
-                <m:t>OnTime</m:t>
-              </m:r>
-              <m:r>
-                <w:rPr>
-                  <w:rFonts w:ascii="Cambria Math" w:eastAsiaTheme="minorEastAsia" w:hAnsi="Cambria Math"/>
-                </w:rPr>
-                <m:t>Wc</m:t>
-              </m:r>
-              <m:r>
-                <w:rPr>
-                  <w:rFonts w:ascii="Cambria Math" w:eastAsiaTheme="minorEastAsia" w:hAnsi="Cambria Math"/>
-                </w:rPr>
-                <m:t>Cap</m:t>
+                <m:t>OnTimeWcCap</m:t>
               </m:r>
             </m:e>
             <m:sub>
@@ -10671,13 +10240,7 @@
                 <w:rPr>
                   <w:rFonts w:ascii="Cambria Math" w:eastAsiaTheme="minorEastAsia" w:hAnsi="Cambria Math"/>
                 </w:rPr>
-                <m:t>f, S</m:t>
-              </m:r>
-              <m:r>
-                <w:rPr>
-                  <w:rFonts w:ascii="Cambria Math" w:eastAsiaTheme="minorEastAsia" w:hAnsi="Cambria Math"/>
-                </w:rPr>
-                <m:t>P</m:t>
+                <m:t>f, SP</m:t>
               </m:r>
             </m:sub>
           </m:sSub>
@@ -10709,13 +10272,7 @@
                 <w:rPr>
                   <w:rFonts w:ascii="Cambria Math" w:eastAsiaTheme="minorEastAsia" w:hAnsi="Cambria Math"/>
                 </w:rPr>
-                <m:t>f, S</m:t>
-              </m:r>
-              <m:r>
-                <w:rPr>
-                  <w:rFonts w:ascii="Cambria Math" w:eastAsiaTheme="minorEastAsia" w:hAnsi="Cambria Math"/>
-                </w:rPr>
-                <m:t>P</m:t>
+                <m:t>f, SP</m:t>
               </m:r>
             </m:sub>
             <m:sup>
@@ -10841,19 +10398,7 @@
                     <w:rPr>
                       <w:rFonts w:ascii="Cambria Math" w:hAnsi="Cambria Math"/>
                     </w:rPr>
-                    <m:t>0</m:t>
-                  </m:r>
-                  <m:r>
-                    <w:rPr>
-                      <w:rFonts w:ascii="Cambria Math" w:hAnsi="Cambria Math"/>
-                    </w:rPr>
-                    <m:t>,  &amp;</m:t>
-                  </m:r>
-                  <m:r>
-                    <w:rPr>
-                      <w:rFonts w:ascii="Cambria Math" w:hAnsi="Cambria Math"/>
-                    </w:rPr>
-                    <m:t xml:space="preserve"> </m:t>
+                    <m:t xml:space="preserve">0,  &amp; </m:t>
                   </m:r>
                   <m:sSub>
                     <m:sSubPr>
@@ -10945,13 +10490,7 @@
                     <w:rPr>
                       <w:rFonts w:ascii="Cambria Math" w:hAnsi="Cambria Math"/>
                     </w:rPr>
-                    <m:t>,</m:t>
-                  </m:r>
-                  <m:r>
-                    <w:rPr>
-                      <w:rFonts w:ascii="Cambria Math" w:hAnsi="Cambria Math"/>
-                    </w:rPr>
-                    <m:t xml:space="preserve">  </m:t>
+                    <m:t xml:space="preserve">,  </m:t>
                   </m:r>
                   <m:sSub>
                     <m:sSubPr>
@@ -10983,13 +10522,7 @@
                     <w:rPr>
                       <w:rFonts w:ascii="Cambria Math" w:hAnsi="Cambria Math"/>
                     </w:rPr>
-                    <m:t xml:space="preserve"> &gt;</m:t>
-                  </m:r>
-                  <m:r>
-                    <w:rPr>
-                      <w:rFonts w:ascii="Cambria Math" w:hAnsi="Cambria Math"/>
-                    </w:rPr>
-                    <m:t xml:space="preserve"> </m:t>
+                    <m:t xml:space="preserve"> &gt; </m:t>
                   </m:r>
                   <m:sSup>
                     <m:sSupPr>
@@ -11054,13 +10587,7 @@
                 <w:rPr>
                   <w:rFonts w:ascii="Cambria Math" w:hAnsi="Cambria Math"/>
                 </w:rPr>
-                <m:t>f, S</m:t>
-              </m:r>
-              <m:r>
-                <w:rPr>
-                  <w:rFonts w:ascii="Cambria Math" w:hAnsi="Cambria Math"/>
-                </w:rPr>
-                <m:t>P</m:t>
+                <m:t>f, SP</m:t>
               </m:r>
             </m:sub>
           </m:sSub>
@@ -11096,19 +10623,7 @@
                     <w:rPr>
                       <w:rFonts w:ascii="Cambria Math" w:hAnsi="Cambria Math"/>
                     </w:rPr>
-                    <m:t>0</m:t>
-                  </m:r>
-                  <m:r>
-                    <w:rPr>
-                      <w:rFonts w:ascii="Cambria Math" w:hAnsi="Cambria Math"/>
-                    </w:rPr>
-                    <m:t>,  &amp;</m:t>
-                  </m:r>
-                  <m:r>
-                    <w:rPr>
-                      <w:rFonts w:ascii="Cambria Math" w:hAnsi="Cambria Math"/>
-                    </w:rPr>
-                    <m:t xml:space="preserve"> </m:t>
+                    <m:t xml:space="preserve">0,  &amp; </m:t>
                   </m:r>
                   <m:sSub>
                     <m:sSubPr>
@@ -11132,13 +10647,7 @@
                         <w:rPr>
                           <w:rFonts w:ascii="Cambria Math" w:hAnsi="Cambria Math"/>
                         </w:rPr>
-                        <m:t>f, S</m:t>
-                      </m:r>
-                      <m:r>
-                        <w:rPr>
-                          <w:rFonts w:ascii="Cambria Math" w:hAnsi="Cambria Math"/>
-                        </w:rPr>
-                        <m:t>P</m:t>
+                        <m:t>f, SP</m:t>
                       </m:r>
                     </m:sub>
                   </m:sSub>
@@ -11206,13 +10715,7 @@
                     <w:rPr>
                       <w:rFonts w:ascii="Cambria Math" w:hAnsi="Cambria Math"/>
                     </w:rPr>
-                    <m:t>,</m:t>
-                  </m:r>
-                  <m:r>
-                    <w:rPr>
-                      <w:rFonts w:ascii="Cambria Math" w:hAnsi="Cambria Math"/>
-                    </w:rPr>
-                    <m:t xml:space="preserve">  </m:t>
+                    <m:t xml:space="preserve">,  </m:t>
                   </m:r>
                   <m:sSub>
                     <m:sSubPr>
@@ -11236,13 +10739,7 @@
                         <w:rPr>
                           <w:rFonts w:ascii="Cambria Math" w:hAnsi="Cambria Math"/>
                         </w:rPr>
-                        <m:t>f, S</m:t>
-                      </m:r>
-                      <m:r>
-                        <w:rPr>
-                          <w:rFonts w:ascii="Cambria Math" w:hAnsi="Cambria Math"/>
-                        </w:rPr>
-                        <m:t>P</m:t>
+                        <m:t>f, SP</m:t>
                       </m:r>
                     </m:sub>
                   </m:sSub>
@@ -11584,13 +11081,7 @@
             <w:rPr>
               <w:rFonts w:ascii="Cambria Math" w:hAnsi="Cambria Math"/>
             </w:rPr>
-            <m:t>ArrivalSLA%=</m:t>
-          </m:r>
-          <m:r>
-            <w:rPr>
-              <w:rFonts w:ascii="Cambria Math" w:hAnsi="Cambria Math"/>
-            </w:rPr>
-            <m:t>100</m:t>
+            <m:t>ArrivalSLA%=100</m:t>
           </m:r>
           <m:d>
             <m:dPr>
@@ -11816,19 +11307,7 @@
               <w:rPr>
                 <w:rFonts w:ascii="Cambria Math" w:hAnsi="Cambria Math"/>
               </w:rPr>
-              <m:t>f</m:t>
-            </m:r>
-            <m:r>
-              <w:rPr>
-                <w:rFonts w:ascii="Cambria Math" w:hAnsi="Cambria Math"/>
-              </w:rPr>
-              <m:t>,r</m:t>
-            </m:r>
-            <m:r>
-              <w:rPr>
-                <w:rFonts w:ascii="Cambria Math" w:hAnsi="Cambria Math"/>
-              </w:rPr>
-              <m:t>,m</m:t>
+              <m:t>f,r,m</m:t>
             </m:r>
           </m:sub>
         </m:sSub>
@@ -11845,12 +11324,14 @@
         </w:rPr>
         <w:t xml:space="preserve">: Equals 1 if </w:t>
       </w:r>
+      <w:proofErr w:type="spellStart"/>
       <w:r>
         <w:rPr>
           <w:rFonts w:eastAsiaTheme="minorEastAsia"/>
         </w:rPr>
         <w:t>ambulift</w:t>
       </w:r>
+      <w:proofErr w:type="spellEnd"/>
       <w:r>
         <w:rPr>
           <w:rFonts w:eastAsiaTheme="minorEastAsia"/>
@@ -11908,19 +11389,7 @@
           <w:rPr>
             <w:rFonts w:ascii="Cambria Math" w:eastAsiaTheme="minorEastAsia" w:hAnsi="Cambria Math"/>
           </w:rPr>
-          <m:t>m</m:t>
-        </m:r>
-        <m:r>
-          <w:rPr>
-            <w:rFonts w:ascii="Cambria Math" w:eastAsiaTheme="minorEastAsia" w:hAnsi="Cambria Math"/>
-          </w:rPr>
-          <m:t xml:space="preserve">, </m:t>
-        </m:r>
-        <m:r>
-          <w:rPr>
-            <w:rFonts w:ascii="Cambria Math" w:eastAsiaTheme="minorEastAsia" w:hAnsi="Cambria Math"/>
-          </w:rPr>
-          <m:t>0</m:t>
+          <m:t>m, 0</m:t>
         </m:r>
       </m:oMath>
       <w:r>
@@ -12001,19 +11470,7 @@
               <w:rPr>
                 <w:rFonts w:ascii="Cambria Math" w:hAnsi="Cambria Math"/>
               </w:rPr>
-              <m:t>f</m:t>
-            </m:r>
-            <m:r>
-              <w:rPr>
-                <w:rFonts w:ascii="Cambria Math" w:hAnsi="Cambria Math"/>
-              </w:rPr>
-              <m:t>,r</m:t>
-            </m:r>
-            <m:r>
-              <w:rPr>
-                <w:rFonts w:ascii="Cambria Math" w:hAnsi="Cambria Math"/>
-              </w:rPr>
-              <m:t>,m</m:t>
+              <m:t>f,r,m</m:t>
             </m:r>
           </m:sub>
         </m:sSub>
@@ -12030,12 +11487,14 @@
         </w:rPr>
         <w:t xml:space="preserve">: Equals 1 if </w:t>
       </w:r>
+      <w:proofErr w:type="spellStart"/>
       <w:r>
         <w:rPr>
           <w:rFonts w:eastAsiaTheme="minorEastAsia"/>
         </w:rPr>
         <w:t>miniubus</w:t>
       </w:r>
+      <w:proofErr w:type="spellEnd"/>
       <w:r>
         <w:rPr>
           <w:rFonts w:eastAsiaTheme="minorEastAsia"/>
@@ -12087,19 +11546,7 @@
           <w:rPr>
             <w:rFonts w:ascii="Cambria Math" w:eastAsiaTheme="minorEastAsia" w:hAnsi="Cambria Math"/>
           </w:rPr>
-          <m:t>m</m:t>
-        </m:r>
-        <m:r>
-          <w:rPr>
-            <w:rFonts w:ascii="Cambria Math" w:eastAsiaTheme="minorEastAsia" w:hAnsi="Cambria Math"/>
-          </w:rPr>
-          <m:t xml:space="preserve">, </m:t>
-        </m:r>
-        <m:r>
-          <w:rPr>
-            <w:rFonts w:ascii="Cambria Math" w:eastAsiaTheme="minorEastAsia" w:hAnsi="Cambria Math"/>
-          </w:rPr>
-          <m:t>0</m:t>
+          <m:t>m, 0</m:t>
         </m:r>
       </m:oMath>
       <w:r>
@@ -12227,13 +11674,7 @@
         <w:rPr>
           <w:rFonts w:eastAsiaTheme="minorEastAsia"/>
         </w:rPr>
-        <w:t xml:space="preserve">is </w:t>
-      </w:r>
-      <w:r>
-        <w:rPr>
-          <w:rFonts w:eastAsiaTheme="minorEastAsia"/>
-        </w:rPr>
-        <w:t>used at least once, 0 otherwise.</w:t>
+        <w:t>is used at least once, 0 otherwise.</w:t>
       </w:r>
     </w:p>
     <w:p>
@@ -12316,23 +11757,19 @@
         </w:rPr>
         <w:t xml:space="preserve">is </w:t>
       </w:r>
+      <w:proofErr w:type="spellStart"/>
       <w:r>
         <w:rPr>
           <w:rFonts w:eastAsiaTheme="minorEastAsia"/>
         </w:rPr>
         <w:t>puchased</w:t>
       </w:r>
-      <w:r>
-        <w:rPr>
-          <w:rFonts w:eastAsiaTheme="minorEastAsia"/>
-        </w:rPr>
-        <w:t>, 0 otherwise.</w:t>
-      </w:r>
-      <w:r>
-        <w:rPr>
-          <w:rFonts w:eastAsiaTheme="minorEastAsia"/>
-        </w:rPr>
-        <w:t xml:space="preserve"> Where </w:t>
+      <w:proofErr w:type="spellEnd"/>
+      <w:r>
+        <w:rPr>
+          <w:rFonts w:eastAsiaTheme="minorEastAsia"/>
+        </w:rPr>
+        <w:t xml:space="preserve">, 0 otherwise. Where </w:t>
       </w:r>
       <m:oMath>
         <m:r>
@@ -12415,6 +11852,7 @@
         </w:rPr>
         <w:t xml:space="preserve"> a</w:t>
       </w:r>
+      <w:proofErr w:type="spellStart"/>
       <w:r>
         <w:rPr>
           <w:rFonts w:eastAsiaTheme="minorEastAsia"/>
@@ -12425,7 +11863,14 @@
         <w:rPr>
           <w:rFonts w:eastAsiaTheme="minorEastAsia"/>
         </w:rPr>
-        <w:t xml:space="preserve">d vertical mode </w:t>
+        <w:t>d</w:t>
+      </w:r>
+      <w:proofErr w:type="spellEnd"/>
+      <w:r>
+        <w:rPr>
+          <w:rFonts w:eastAsiaTheme="minorEastAsia"/>
+        </w:rPr>
+        <w:t xml:space="preserve"> vertical mode </w:t>
       </w:r>
       <m:oMath>
         <m:r>
@@ -12541,25 +11986,7 @@
         <w:rPr>
           <w:rFonts w:eastAsiaTheme="minorEastAsia"/>
         </w:rPr>
-        <w:t xml:space="preserve"> a</w:t>
-      </w:r>
-      <w:r>
-        <w:rPr>
-          <w:rFonts w:eastAsiaTheme="minorEastAsia"/>
-        </w:rPr>
-        <w:t>n</w:t>
-      </w:r>
-      <w:r>
-        <w:rPr>
-          <w:rFonts w:eastAsiaTheme="minorEastAsia"/>
-        </w:rPr>
-        <w:t xml:space="preserve">d </w:t>
-      </w:r>
-      <w:r>
-        <w:rPr>
-          <w:rFonts w:eastAsiaTheme="minorEastAsia"/>
-        </w:rPr>
-        <w:t xml:space="preserve">minibus-supported mode </w:t>
+        <w:t xml:space="preserve"> and minibus-supported mode </w:t>
       </w:r>
       <m:oMath>
         <m:r>
@@ -13216,13 +12643,7 @@
             <w:rPr>
               <w:rFonts w:ascii="Cambria Math" w:eastAsiaTheme="minorEastAsia" w:hAnsi="Cambria Math"/>
             </w:rPr>
-            <m:t>=v}</m:t>
-          </m:r>
-          <m:r>
-            <w:rPr>
-              <w:rFonts w:ascii="Cambria Math" w:eastAsiaTheme="minorEastAsia" w:hAnsi="Cambria Math"/>
-            </w:rPr>
-            <m:t xml:space="preserve"> </m:t>
+            <m:t xml:space="preserve">=v} </m:t>
           </m:r>
         </m:oMath>
       </m:oMathPara>
@@ -14099,13 +13520,7 @@
             <w:rPr>
               <w:rFonts w:ascii="Cambria Math" w:eastAsiaTheme="minorEastAsia" w:hAnsi="Cambria Math"/>
             </w:rPr>
-            <m:t xml:space="preserve"> ≤</m:t>
-          </m:r>
-          <m:r>
-            <w:rPr>
-              <w:rFonts w:ascii="Cambria Math" w:eastAsiaTheme="minorEastAsia" w:hAnsi="Cambria Math"/>
-            </w:rPr>
-            <m:t xml:space="preserve"> 1- </m:t>
+            <m:t xml:space="preserve"> ≤ 1- </m:t>
           </m:r>
           <m:sSub>
             <m:sSubPr>
@@ -14679,19 +14094,7 @@
                 <w:rPr>
                   <w:rFonts w:ascii="Cambria Math" w:hAnsi="Cambria Math"/>
                 </w:rPr>
-                <m:t>v</m:t>
-              </m:r>
-              <m:r>
-                <w:rPr>
-                  <w:rFonts w:ascii="Cambria Math" w:hAnsi="Cambria Math"/>
-                </w:rPr>
-                <m:t>e</m:t>
-              </m:r>
-              <m:r>
-                <w:rPr>
-                  <w:rFonts w:ascii="Cambria Math" w:hAnsi="Cambria Math"/>
-                </w:rPr>
-                <m:t>rt</m:t>
+                <m:t>vert</m:t>
               </m:r>
             </m:sup>
           </m:sSup>
@@ -15007,83 +14410,15 @@
           <w:i/>
           <w:iCs/>
         </w:rPr>
-        <w:t xml:space="preserve">Minibus </w:t>
-      </w:r>
-      <w:r>
-        <w:rPr>
-          <w:rFonts w:eastAsiaTheme="minorEastAsia"/>
-          <w:b/>
-          <w:bCs/>
+        <w:t xml:space="preserve">Minibus Wheelchair Capacity: </w:t>
+      </w:r>
+      <w:r>
+        <w:rPr>
+          <w:rFonts w:eastAsiaTheme="minorEastAsia"/>
           <w:i/>
           <w:iCs/>
         </w:rPr>
-        <w:t>Wheelchair</w:t>
-      </w:r>
-      <w:r>
-        <w:rPr>
-          <w:rFonts w:eastAsiaTheme="minorEastAsia"/>
-          <w:b/>
-          <w:bCs/>
-          <w:i/>
-          <w:iCs/>
-        </w:rPr>
-        <w:t xml:space="preserve"> Capacity: </w:t>
-      </w:r>
-      <w:r>
-        <w:rPr>
-          <w:rFonts w:eastAsiaTheme="minorEastAsia"/>
-          <w:i/>
-          <w:iCs/>
-        </w:rPr>
-        <w:t xml:space="preserve">For minibus-supported modes, assigned minibus </w:t>
-      </w:r>
-      <w:r>
-        <w:rPr>
-          <w:rFonts w:eastAsiaTheme="minorEastAsia"/>
-          <w:i/>
-          <w:iCs/>
-        </w:rPr>
-        <w:t xml:space="preserve">wheelchair </w:t>
-      </w:r>
-      <w:r>
-        <w:rPr>
-          <w:rFonts w:eastAsiaTheme="minorEastAsia"/>
-          <w:i/>
-          <w:iCs/>
-        </w:rPr>
-        <w:t xml:space="preserve">capacity must cover </w:t>
-      </w:r>
-      <w:r>
-        <w:rPr>
-          <w:rFonts w:eastAsiaTheme="minorEastAsia"/>
-          <w:i/>
-          <w:iCs/>
-        </w:rPr>
-        <w:t>wheelchair</w:t>
-      </w:r>
-      <w:r>
-        <w:rPr>
-          <w:rFonts w:eastAsiaTheme="minorEastAsia"/>
-          <w:i/>
-          <w:iCs/>
-        </w:rPr>
-        <w:t xml:space="preserve"> demand unless a </w:t>
-      </w:r>
-      <w:r>
-        <w:rPr>
-          <w:rFonts w:eastAsiaTheme="minorEastAsia"/>
-          <w:i/>
-          <w:iCs/>
-        </w:rPr>
-        <w:t>wheelchair</w:t>
-      </w:r>
-      <w:r>
-        <w:rPr>
-          <w:rFonts w:eastAsiaTheme="minorEastAsia"/>
-          <w:i/>
-          <w:iCs/>
-        </w:rPr>
-        <w:t>-capacity shortfall is used:</w:t>
+        <w:t>For minibus-supported modes, assigned minibus wheelchair capacity must cover wheelchair demand unless a wheelchair-capacity shortfall is used:</w:t>
       </w:r>
     </w:p>
     <w:p>
@@ -15535,25 +14870,10 @@
           <w:i/>
           <w:iCs/>
         </w:rPr>
-        <w:t>Minibus</w:t>
-      </w:r>
-      <w:r>
-        <w:rPr>
-          <w:b/>
-          <w:bCs/>
-          <w:i/>
-          <w:iCs/>
-        </w:rPr>
-        <w:t xml:space="preserve"> Use Activation: </w:t>
-      </w:r>
-      <w:r>
-        <w:t xml:space="preserve">If </w:t>
-      </w:r>
-      <w:r>
-        <w:t>a minibus</w:t>
-      </w:r>
-      <w:r>
-        <w:t xml:space="preserve"> is assigned to a flight, it must be marked as used:</w:t>
+        <w:t xml:space="preserve">Minibus Use Activation: </w:t>
+      </w:r>
+      <w:r>
+        <w:t>If a minibus is assigned to a flight, it must be marked as used:</w:t>
       </w:r>
     </w:p>
     <w:p>
@@ -15692,46 +15012,10 @@
           <w:i/>
           <w:iCs/>
         </w:rPr>
-        <w:t xml:space="preserve">Future </w:t>
-      </w:r>
-      <w:r>
-        <w:rPr>
-          <w:b/>
-          <w:bCs/>
-          <w:i/>
-          <w:iCs/>
-        </w:rPr>
-        <w:t xml:space="preserve">Minibus </w:t>
-      </w:r>
-      <w:r>
-        <w:rPr>
-          <w:b/>
-          <w:bCs/>
-          <w:i/>
-          <w:iCs/>
-        </w:rPr>
-        <w:t>Purchase Requirement</w:t>
-      </w:r>
-      <w:r>
-        <w:rPr>
-          <w:b/>
-          <w:bCs/>
-          <w:i/>
-          <w:iCs/>
-        </w:rPr>
-        <w:t xml:space="preserve">: </w:t>
-      </w:r>
-      <w:r>
-        <w:t>A future</w:t>
-      </w:r>
-      <w:r>
-        <w:t xml:space="preserve"> minibus</w:t>
-      </w:r>
-      <w:r>
-        <w:t xml:space="preserve"> candidate can only be assigned if purchased:</w:t>
-      </w:r>
-      <w:r>
-        <w:t xml:space="preserve"> </w:t>
+        <w:t xml:space="preserve">Future Minibus Purchase Requirement: </w:t>
+      </w:r>
+      <w:r>
+        <w:t xml:space="preserve">A future minibus candidate can only be assigned if purchased: </w:t>
       </w:r>
     </w:p>
     <w:p>
@@ -15875,34 +15159,10 @@
           <w:i/>
           <w:iCs/>
         </w:rPr>
-        <w:t xml:space="preserve">Future </w:t>
-      </w:r>
-      <w:r>
-        <w:rPr>
-          <w:b/>
-          <w:bCs/>
-          <w:i/>
-          <w:iCs/>
-        </w:rPr>
-        <w:t>Vehicle Use Requires Purchase</w:t>
-      </w:r>
-      <w:r>
-        <w:rPr>
-          <w:b/>
-          <w:bCs/>
-          <w:i/>
-          <w:iCs/>
-        </w:rPr>
-        <w:t xml:space="preserve">: </w:t>
-      </w:r>
-      <w:r>
-        <w:t>A future minibus candidate can only be</w:t>
-      </w:r>
-      <w:r>
-        <w:t xml:space="preserve"> marked as used if it is purchased</w:t>
-      </w:r>
-      <w:r>
-        <w:t xml:space="preserve"> </w:t>
+        <w:t xml:space="preserve">Future Vehicle Use Requires Purchase: </w:t>
+      </w:r>
+      <w:r>
+        <w:t xml:space="preserve">A future minibus candidate can only be marked as used if it is purchased </w:t>
       </w:r>
     </w:p>
     <w:p>
@@ -18067,13 +17327,7 @@
                 <w:rPr>
                   <w:rFonts w:ascii="Cambria Math" w:eastAsiaTheme="minorEastAsia" w:hAnsi="Cambria Math"/>
                 </w:rPr>
-                <m:t>f, S</m:t>
-              </m:r>
-              <m:r>
-                <w:rPr>
-                  <w:rFonts w:ascii="Cambria Math" w:eastAsiaTheme="minorEastAsia" w:hAnsi="Cambria Math"/>
-                </w:rPr>
-                <m:t>M</m:t>
+                <m:t>f, SM</m:t>
               </m:r>
             </m:sub>
           </m:sSub>
@@ -18142,13 +17396,7 @@
                 <w:rPr>
                   <w:rFonts w:ascii="Cambria Math" w:eastAsiaTheme="minorEastAsia" w:hAnsi="Cambria Math"/>
                 </w:rPr>
-                <m:t xml:space="preserve">f, </m:t>
-              </m:r>
-              <m:r>
-                <w:rPr>
-                  <w:rFonts w:ascii="Cambria Math" w:eastAsiaTheme="minorEastAsia" w:hAnsi="Cambria Math"/>
-                </w:rPr>
-                <m:t>CM</m:t>
+                <m:t>f, CM</m:t>
               </m:r>
             </m:sub>
           </m:sSub>
@@ -18249,13 +17497,7 @@
                 <w:rPr>
                   <w:rFonts w:ascii="Cambria Math" w:eastAsiaTheme="minorEastAsia" w:hAnsi="Cambria Math"/>
                 </w:rPr>
-                <m:t>f, C</m:t>
-              </m:r>
-              <m:r>
-                <w:rPr>
-                  <w:rFonts w:ascii="Cambria Math" w:eastAsiaTheme="minorEastAsia" w:hAnsi="Cambria Math"/>
-                </w:rPr>
-                <m:t>P</m:t>
+                <m:t>f, CP</m:t>
               </m:r>
             </m:sub>
           </m:sSub>
@@ -18311,13 +17553,7 @@
                 <w:rPr>
                   <w:rFonts w:ascii="Cambria Math" w:eastAsiaTheme="minorEastAsia" w:hAnsi="Cambria Math"/>
                 </w:rPr>
-                <m:t>Staff</m:t>
-              </m:r>
-              <m:r>
-                <w:rPr>
-                  <w:rFonts w:ascii="Cambria Math" w:eastAsiaTheme="minorEastAsia" w:hAnsi="Cambria Math"/>
-                </w:rPr>
-                <m:t>PerPRM</m:t>
+                <m:t>StaffPerPRM</m:t>
               </m:r>
             </m:e>
             <m:sub>
@@ -18394,19 +17630,7 @@
                 <w:rPr>
                   <w:rFonts w:ascii="Cambria Math" w:eastAsiaTheme="minorEastAsia" w:hAnsi="Cambria Math"/>
                 </w:rPr>
-                <m:t xml:space="preserve">f, </m:t>
-              </m:r>
-              <m:r>
-                <w:rPr>
-                  <w:rFonts w:ascii="Cambria Math" w:eastAsiaTheme="minorEastAsia" w:hAnsi="Cambria Math"/>
-                </w:rPr>
-                <m:t>S</m:t>
-              </m:r>
-              <m:r>
-                <w:rPr>
-                  <w:rFonts w:ascii="Cambria Math" w:eastAsiaTheme="minorEastAsia" w:hAnsi="Cambria Math"/>
-                </w:rPr>
-                <m:t>P</m:t>
+                <m:t>f, SP</m:t>
               </m:r>
             </m:sub>
           </m:sSub>
@@ -19632,13 +18856,7 @@
                 <w:rPr>
                   <w:rFonts w:ascii="Cambria Math" w:eastAsiaTheme="minorEastAsia" w:hAnsi="Cambria Math"/>
                 </w:rPr>
-                <m:t xml:space="preserve">r ∈ </m:t>
-              </m:r>
-              <m:r>
-                <w:rPr>
-                  <w:rFonts w:ascii="Cambria Math" w:eastAsiaTheme="minorEastAsia" w:hAnsi="Cambria Math"/>
-                </w:rPr>
-                <m:t>R</m:t>
+                <m:t>r ∈ R</m:t>
               </m:r>
             </m:sub>
             <m:sup/>
@@ -20052,13 +19270,7 @@
                             <w:rPr>
                               <w:rFonts w:ascii="Cambria Math" w:eastAsiaTheme="minorEastAsia" w:hAnsi="Cambria Math"/>
                             </w:rPr>
-                            <m:t xml:space="preserve">m </m:t>
-                          </m:r>
-                          <m:r>
-                            <w:rPr>
-                              <w:rFonts w:ascii="Cambria Math" w:eastAsiaTheme="minorEastAsia" w:hAnsi="Cambria Math"/>
-                            </w:rPr>
-                            <m:t>∈</m:t>
+                            <m:t>m ∈</m:t>
                           </m:r>
                           <m:sSup>
                             <m:sSupPr>

</xml_diff>